<commit_message>
contract: LGSA v0.3 repair pass (Pilot move-on, weekly cap, refund cap, Uncontactable Lead)
- 9.5/9.7: a move on from the Pilot is made only under 9.7 (pay the next Plan's Fee in advance, no 9.5 notice); S1.3 states the Silver and Gold Fees instead of bracketed placeholders and the generator lists Bronze for a Pilot Client
- 1.1.28 and Schedule 1: state the 3 requests per Calendar Week maximum
- 1.1.35: Uncontactable Lead uses the same two calls as S3.4(a)
- 6.3, 11.6, S1.1: total refund never exceeds what the Client paid (rounded Effective Lead Price over-refunded Silver by R10 and Gold by R5)
- D11/D12 lawyer notes corrected; open-items sections 7 and 8 record what was fixed and what was left on purpose
- make-sources.mjs and agreement.ts fail or warn when these drop out or drift from pricing.seed.json

Co-Authored-By: Claude Sonnet 5.5 <noreply@anthropic.com>
</commit_message>
<xml_diff>
--- a/deliverables/contracts-drafter/lead-generation-agreement/lead-velocity-services-agreement.docx
+++ b/deliverables/contracts-drafter/lead-generation-agreement/lead-velocity-services-agreement.docx
@@ -1185,7 +1185,7 @@
         <w:t xml:space="preserve">Replacement Lead</w:t>
       </w:r>
       <w:r>
-        <w:t xml:space="preserve">" means a Qualified Lead that Lead Velocity chooses to supply under clause 7 in place of a No-Show Lead or an Uncontactable Lead;</w:t>
+        <w:t xml:space="preserve">" means a Qualified Lead that Lead Velocity chooses to supply under clause 7 in place of a No-Show Lead or an Uncontactable Lead, within the maximum of 3 replacement requests per Calendar Week in clause 7.2;</w:t>
       </w:r>
     </w:p>
     <w:p>
@@ -1370,7 +1370,7 @@
         <w:t xml:space="preserve">Uncontactable Lead</w:t>
       </w:r>
       <w:r>
-        <w:t xml:space="preserve">" means a Qualified Lead whom the Client could not reach after Delivery and before the Consumer attended any appointment with the Client, either because the Consumer did not answer the Client's call at the booked start time of an appointment held by phone or WhatsApp call, or because the Consumer did not answer or reply to at least 3 attempts by the Client to reach the Consumer over at least 72 hours, as established under Schedule 3. A lead whose contact details are shown to be wrong, disconnected or someone else's is not an Uncontactable Lead; clause 5.8(d) applies to it;</w:t>
+        <w:t xml:space="preserve">" means a Qualified Lead whom the Client could not reach after Delivery and before the Consumer attended any appointment with the Client, either because, for an appointment held by phone or WhatsApp call, the Consumer answered neither of the Client's calls (made at the booked start time and again at least 10 minutes later, on every phone number in the Lead Data), or because, in any other case, the Consumer did not answer or reply to at least 3 attempts by the Client to reach the Consumer over at least 72 hours, in each case as established under Schedule 3 (S3.4). A lead whose contact details are shown to be wrong, disconnected or someone else's is not an Uncontactable Lead; clause 5.8(d) applies to it;</w:t>
       </w:r>
     </w:p>
     <w:p>
@@ -3005,7 +3005,7 @@
         <w:t xml:space="preserve">After day 44: refund on request.</w:t>
       </w:r>
       <w:r>
-        <w:t xml:space="preserve"> At any time after day 44, the Client may instead ask in writing for a refund of the leads not yet Delivered. Lead Velocity will then refund, for each of those leads, the Effective Lead Price of the Client's Plan for the Billing Cycle in which the lead was due (for example, for Bronze, R16,500 ÷ 20 = R825 per lead; at the Fees in Schedule 1 the others are Pilot R850, Silver R817 and Gold R789) within 7 Business Days of the request. Leads refunded no longer roll over.</w:t>
+        <w:t xml:space="preserve"> At any time after day 44, the Client may instead ask in writing for a refund of the leads not yet Delivered. Lead Velocity will then refund, for each of those leads, the Effective Lead Price of the Client's Plan for the Billing Cycle in which the lead was due (for example, for Bronze, R16,500 ÷ 20 = R825 per lead; at the Fees in Schedule 1 the others are Pilot R850, Silver R817 and Gold R789) within 7 Business Days of the request. Because the Effective Lead Price is rounded, the total refunded for a Billing Cycle (or for a Top-Up) is never more than the Client paid for it. Leads refunded no longer roll over.</w:t>
       </w:r>
     </w:p>
     <w:p>
@@ -3111,7 +3111,7 @@
           <w:sz w:val="18"/>
           <w:szCs w:val="18"/>
         </w:rPr>
-        <w:t xml:space="preserve">[LAWYER REVIEW (D12): Jonathan decided on 10 Oct 2026 that every refund of an undelivered lead, Top-Up Leads included, is at the Effective Lead Price of the Client's Plan (Pilot R850, Bronze R825, Silver R817, Gold R789). A Top-Up Lead is sold at the Top-Up Price (R850), so on Bronze, Silver and Gold the refund is R25, R33 or R61 below the price paid. Confirm this is defensible under CPA s48 and s54 where the CPA applies, and that "the Plan when the leads were due" is the intended reading of "the Plan at the time".]</w:t>
+        <w:t xml:space="preserve">[LAWYER REVIEW (D12): Jonathan decided on 10 Oct 2026 that every refund of an undelivered lead, Top-Up Leads included, is at the Effective Lead Price of the Client's Plan (Pilot R850, Bronze R825, Silver R817, Gold R789). A Top-Up Lead is sold at the Top-Up Price (R850), so on Bronze, Silver and Gold the refund is R25, R33 or R61 below the price paid. Confirm this is defensible under CPA s48 and s54 where the CPA applies. Confirm also the reading adopted in 6.3, 6.6 and 11.6: the Plan for the Billing Cycle in which the lead was due (for a Top-Up Lead, the Plan when the Top-Up was ordered), not the Plan on the day of the refund request (open-items.md section 7, question 3). Because the Effective Lead Price is rounded to the nearest rand, refunding every lead of a full Silver or Gold cycle would exceed the Fee by R10 or R5 (30 x R817 = R24,510 against R24,500; 45 x R789 = R35,505 against R35,500), so 6.3 and 11.6 cap the total refunded at what the Client paid.]</w:t>
       </w:r>
     </w:p>
     <w:p>
@@ -3140,7 +3140,7 @@
           <w:sz w:val="18"/>
           <w:szCs w:val="18"/>
         </w:rPr>
-        <w:t xml:space="preserve">[LAWYER REVIEW (D11): Replacements stay discretionary goodwill, as in v0.1 and v0.2. The cap is 3 requests per Calendar Week for every Plan, the Pilot Plan included. An Uncontactable Lead ("couldn't reach them") can now earn a replacement, inside the same 3 as no-shows. Clause 7.8 (dispute evidence) is from v0.2. A replacement turns only on attendance and contactability, which clause 8.4 allows, and never on a sale, application or policy.]</w:t>
+        <w:t xml:space="preserve">[LAWYER REVIEW (D11): Replacements stay discretionary goodwill, as in v0.1 and v0.2. The cap is 3 requests per Calendar Week for every Plan, the Pilot Plan included. An Uncontactable Lead ("couldn't reach them") can now earn a replacement, inside the same 3 as no-shows. Clause 7.8 (dispute evidence) is from v0.2. A replacement turns only on attendance and contactability, which are the only feedback clause 8.4 lets the Client give (clause 14.3(c)), and never on a sale, application or policy. The last sentence of 8.4 ("No outcome of any appointment affects any Fee, Top-Up Price, credit, refund or replacement") is left word for word, as instructed, and read literally it does not carve out this clause 7. Confirm it is to be read as "no outcome other than attendance and contactability", or change it to "no sales outcome" (open-items.md section 7, question 7).]</w:t>
       </w:r>
     </w:p>
     <w:p>
@@ -3693,7 +3693,7 @@
         <w:t xml:space="preserve">Plan upgrade.</w:t>
       </w:r>
       <w:r>
-        <w:t xml:space="preserve"> Instead of a Top-Up, the Client may upgrade to the Silver or Gold Plan at the pricing then shown on the Pricing Page, by giving at least 7 days' written notice before the next Billing Cycle starts. The upgrade takes effect from the start of that Billing Cycle, and Schedule 1 is then read with the new Plan's Fee and Committed Leads.</w:t>
+        <w:t xml:space="preserve"> Instead of a Top-Up, the Client may upgrade to the Silver or Gold Plan at the pricing then shown on the Pricing Page, by giving at least 7 days' written notice before the next Billing Cycle starts. The upgrade takes effect from the start of that Billing Cycle, and Schedule 1 is then read with the new Plan's Fee and Committed Leads. A move on from the Pilot Plan is dealt with only under clause 9.7.</w:t>
       </w:r>
     </w:p>
     <w:p>
@@ -3737,7 +3737,7 @@
         <w:t xml:space="preserve">Pilot Plan.</w:t>
       </w:r>
       <w:r>
-        <w:t xml:space="preserve"> The Pilot Plan is available once only, to a Client that has not bought Services from Lead Velocity before, and covers one introductory Billing Cycle. Its Fee and Committed Leads are set out in Schedule 1. Before the Pilot Billing Cycle ends, the Client may continue on the Bronze Plan or a higher Plan by paying that Plan's Fee in advance under clause 10. If it does not, no further Billing Cycle starts and this Agreement ends at the end of the Pilot Billing Cycle, subject to clauses 6 and 11.3. All other terms of this Agreement apply to the Pilot Plan in the same way as to every other Plan, including the flat Fee paid in advance, which includes all advertising media spend (clauses 8 and 10), the absence of any commission or success fee (clause 8.3), the Rollover Period ending on day 44 (clause 6) and the same replacement rules, being replacements of up to 3 per Calendar Week with no separate cap for the Pilot Plan (clause 7).</w:t>
+        <w:t xml:space="preserve"> The Pilot Plan is available once only, to a Client that has not bought Services from Lead Velocity before, and covers one introductory Billing Cycle. Its Fee and Committed Leads are set out in Schedule 1. Before the Pilot Billing Cycle ends, the Client may continue on the Bronze Plan or a higher Plan (Silver or Gold) by paying that Plan's Fee in advance under clause 10, at the pricing shown on the Pricing Page when it pays. That payment is the Client's choice of Plan: no notice under clause 9.5 is needed, and Schedule 1 is then read with that Plan's Fee and Committed Leads from the start of the Billing Cycle it pays for. If the Client does not pay, no further Billing Cycle starts and this Agreement ends at the end of the Pilot Billing Cycle, subject to clauses 6 and 11.3. All other terms of this Agreement apply to the Pilot Plan in the same way as to every other Plan, including the flat Fee paid in advance, which includes all advertising media spend (clauses 8 and 10), the absence of any commission or success fee (clause 8.3), the Rollover Period ending on day 44 (clause 6) and the same replacement rules, being replacements of up to 3 per Calendar Week with no separate cap for the Pilot Plan (clause 7).</w:t>
       </w:r>
     </w:p>
     <w:p>
@@ -4084,7 +4084,7 @@
         <w:t xml:space="preserve">Refund on early termination.</w:t>
       </w:r>
       <w:r>
-        <w:t xml:space="preserve"> If this Agreement ends under clause 11.4 or 11.5 during a Billing Cycle, Lead Velocity will refund the Effective Lead Price of the Client's Plan (for a Top-Up Lead, the Client's Plan when the Top-Up was ordered) for each paid Qualified Lead not yet Delivered, less any amount the Client owes Lead Velocity, within 10 Business Days.</w:t>
+        <w:t xml:space="preserve"> If this Agreement ends under clause 11.4 or 11.5 during a Billing Cycle, Lead Velocity will refund the Effective Lead Price of the Client's Plan (for a Top-Up Lead, the Client's Plan when the Top-Up was ordered) for each paid Qualified Lead not yet Delivered, less any amount the Client owes Lead Velocity, within 10 Business Days, and never more in total than the Client paid for those leads.</w:t>
       </w:r>
     </w:p>
     <w:p>
@@ -6682,7 +6682,7 @@
           </w:tcPr>
           <w:p>
             <w:r>
-              <w:t xml:space="preserve">Rolls into the next cycle on top of its Committed Leads, or refunded on request at this Plan's Effective Lead Price (above), within 7 Business Days</w:t>
+              <w:t xml:space="preserve">Rolls into the next cycle on top of its Committed Leads, or refunded on request at this Plan's Effective Lead Price (above), within 7 Business Days, and never more in total than the Fee paid for the Billing Cycle</w:t>
             </w:r>
           </w:p>
         </w:tc>
@@ -6704,7 +6704,7 @@
           </w:tcPr>
           <w:p>
             <w:r>
-              <w:t xml:space="preserve">Setup or onboarding fee</w:t>
+              <w:t xml:space="preserve">Replacements (clause 7)</w:t>
             </w:r>
           </w:p>
         </w:tc>
@@ -6720,7 +6720,7 @@
           </w:tcPr>
           <w:p>
             <w:r>
-              <w:t xml:space="preserve">None</w:t>
+              <w:t xml:space="preserve">Goodwill, not a right: no more than 3 replacement requests per Calendar Week, whichever Plan (no separate Pilot cap); No-Show Leads and Uncontactable Leads count together inside the same 3</w:t>
             </w:r>
           </w:p>
         </w:tc>
@@ -6742,7 +6742,7 @@
           </w:tcPr>
           <w:p>
             <w:r>
-              <w:t xml:space="preserve">First payment due</w:t>
+              <w:t xml:space="preserve">Setup or onboarding fee</w:t>
             </w:r>
           </w:p>
         </w:tc>
@@ -6758,7 +6758,7 @@
           </w:tcPr>
           <w:p>
             <w:r>
-              <w:t xml:space="preserve">Before the first Billing Cycle starts, on the date stated on Lead Velocity's first invoice</w:t>
+              <w:t xml:space="preserve">None</w:t>
             </w:r>
           </w:p>
         </w:tc>
@@ -6780,6 +6780,44 @@
           </w:tcPr>
           <w:p>
             <w:r>
+              <w:t xml:space="preserve">First payment due</w:t>
+            </w:r>
+          </w:p>
+        </w:tc>
+        <w:tc>
+          <w:tcPr>
+            <w:tcW w:type="dxa" w:w="4649"/>
+            <w:tcMar>
+              <w:top w:type="dxa" w:w="60"/>
+              <w:left w:type="dxa" w:w="100"/>
+              <w:bottom w:type="dxa" w:w="60"/>
+              <w:right w:type="dxa" w:w="100"/>
+            </w:tcMar>
+          </w:tcPr>
+          <w:p>
+            <w:r>
+              <w:t xml:space="preserve">Before the first Billing Cycle starts, on the date stated on Lead Velocity's first invoice</w:t>
+            </w:r>
+          </w:p>
+        </w:tc>
+      </w:tr>
+      <w:tr>
+        <w:trPr>
+          <w:cantSplit/>
+          <w:tblHeader w:val="false"/>
+        </w:trPr>
+        <w:tc>
+          <w:tcPr>
+            <w:tcW w:type="dxa" w:w="4649"/>
+            <w:tcMar>
+              <w:top w:type="dxa" w:w="60"/>
+              <w:left w:type="dxa" w:w="100"/>
+              <w:bottom w:type="dxa" w:w="60"/>
+              <w:right w:type="dxa" w:w="100"/>
+            </w:tcMar>
+          </w:tcPr>
+          <w:p>
+            <w:r>
               <w:t xml:space="preserve">Client status (clause 23.1)</w:t>
             </w:r>
           </w:p>
@@ -6810,6 +6848,26 @@
       <w:pPr>
         <w:spacing w:after="120"/>
       </w:pPr>
+    </w:p>
+    <w:p>
+      <w:pPr>
+        <w:pBdr>
+          <w:left w:val="single" w:color="A6A6A6" w:sz="18" w:space="6"/>
+        </w:pBdr>
+        <w:shd w:fill="F2F2F2" w:color="auto" w:val="clear"/>
+        <w:spacing w:after="160" w:before="60"/>
+        <w:ind w:left="720" w:right="0"/>
+      </w:pPr>
+      <w:r>
+        <w:rPr>
+          <w:i/>
+          <w:iCs/>
+          <w:color w:val="595959"/>
+          <w:sz w:val="18"/>
+          <w:szCs w:val="18"/>
+        </w:rPr>
+        <w:t xml:space="preserve">[DRAFTING NOTE: the table above is the Bronze Plan, the default. For a Pilot, Silver or Gold Client the CRM contract generator replaces the Plan, Fee, Committed Leads and Effective Lead Price rows from the pricing source and lists the other Plans in S1.3. Do not issue this template unchanged to a Client on another Plan.]</w:t>
+      </w:r>
     </w:p>
     <w:p>
       <w:pPr>
@@ -7109,7 +7167,7 @@
         <w:t xml:space="preserve">Other Plans (clauses 9.5 and 9.7).</w:t>
       </w:r>
       <w:r>
-        <w:t xml:space="preserve"> The Pilot Plan is a once-off introductory Plan for first-time clients only (clause 9.7). Silver and Gold are available at the pricing shown on the Pricing Page at the time of upgrade.</w:t>
+        <w:t xml:space="preserve"> The Pilot Plan is a once-off introductory Plan for first-time clients only (clause 9.7). The Fees and Committed Leads below are those on the Signature Date. Silver and Gold are available at the pricing shown on the Pricing Page at the time of upgrade, and a Client that moves on from the Pilot Plan to Bronze, Silver or Gold pays the pricing shown on the Pricing Page when it pays (clause 9.7).</w:t>
       </w:r>
     </w:p>
     <w:tbl>
@@ -7285,21 +7343,7 @@
           </w:tcPr>
           <w:p>
             <w:r>
-              <w:rPr>
-                <w:highlight w:val="yellow"/>
-                <w:highlightCs w:val="yellow"/>
-              </w:rPr>
-              <w:t xml:space="preserve">[PER PRICING PAGE]</w:t>
-            </w:r>
-            <w:r>
-              <w:t xml:space="preserve"> </w:t>
-            </w:r>
-            <w:r>
-              <w:rPr>
-                <w:highlight w:val="yellow"/>
-                <w:highlightCs w:val="yellow"/>
-              </w:rPr>
-              <w:t xml:space="preserve">[CURRENT: R24,500 excl. VAT]</w:t>
+              <w:t xml:space="preserve">R24,500 excl. VAT</w:t>
             </w:r>
           </w:p>
         </w:tc>
@@ -7315,21 +7359,7 @@
           </w:tcPr>
           <w:p>
             <w:r>
-              <w:rPr>
-                <w:highlight w:val="yellow"/>
-                <w:highlightCs w:val="yellow"/>
-              </w:rPr>
-              <w:t xml:space="preserve">[PER PRICING PAGE]</w:t>
-            </w:r>
-            <w:r>
-              <w:t xml:space="preserve"> </w:t>
-            </w:r>
-            <w:r>
-              <w:rPr>
-                <w:highlight w:val="yellow"/>
-                <w:highlightCs w:val="yellow"/>
-              </w:rPr>
-              <w:t xml:space="preserve">[CURRENT: 30 Qualified Leads, about R817 each]</w:t>
+              <w:t xml:space="preserve">30 Qualified Leads, about R817 each</w:t>
             </w:r>
           </w:p>
         </w:tc>
@@ -7367,21 +7397,7 @@
           </w:tcPr>
           <w:p>
             <w:r>
-              <w:rPr>
-                <w:highlight w:val="yellow"/>
-                <w:highlightCs w:val="yellow"/>
-              </w:rPr>
-              <w:t xml:space="preserve">[PER PRICING PAGE]</w:t>
-            </w:r>
-            <w:r>
-              <w:t xml:space="preserve"> </w:t>
-            </w:r>
-            <w:r>
-              <w:rPr>
-                <w:highlight w:val="yellow"/>
-                <w:highlightCs w:val="yellow"/>
-              </w:rPr>
-              <w:t xml:space="preserve">[CURRENT: R35,500 excl. VAT]</w:t>
+              <w:t xml:space="preserve">R35,500 excl. VAT</w:t>
             </w:r>
           </w:p>
         </w:tc>
@@ -7397,21 +7413,7 @@
           </w:tcPr>
           <w:p>
             <w:r>
-              <w:rPr>
-                <w:highlight w:val="yellow"/>
-                <w:highlightCs w:val="yellow"/>
-              </w:rPr>
-              <w:t xml:space="preserve">[PER PRICING PAGE]</w:t>
-            </w:r>
-            <w:r>
-              <w:t xml:space="preserve"> </w:t>
-            </w:r>
-            <w:r>
-              <w:rPr>
-                <w:highlight w:val="yellow"/>
-                <w:highlightCs w:val="yellow"/>
-              </w:rPr>
-              <w:t xml:space="preserve">[CURRENT: 45 Qualified Leads, about R789 each]</w:t>
+              <w:t xml:space="preserve">45 Qualified Leads, about R789 each</w:t>
             </w:r>
           </w:p>
         </w:tc>
@@ -7421,6 +7423,26 @@
       <w:pPr>
         <w:spacing w:after="120"/>
       </w:pPr>
+    </w:p>
+    <w:p>
+      <w:pPr>
+        <w:pBdr>
+          <w:left w:val="single" w:color="A6A6A6" w:sz="18" w:space="6"/>
+        </w:pBdr>
+        <w:shd w:fill="F2F2F2" w:color="auto" w:val="clear"/>
+        <w:spacing w:after="160" w:before="60"/>
+        <w:ind w:left="720" w:right="0"/>
+      </w:pPr>
+      <w:r>
+        <w:rPr>
+          <w:i/>
+          <w:iCs/>
+          <w:color w:val="595959"/>
+          <w:sz w:val="18"/>
+          <w:szCs w:val="18"/>
+        </w:rPr>
+        <w:t xml:space="preserve">[DRAFTING NOTE: for a Client on the Pilot Plan the CRM contract generator lists Bronze, Silver and Gold here, taken from the pricing source, so the Fee and Committed Leads of the Plan the Client moves on to (clause 9.7) are in Schedule 1.]</w:t>
+      </w:r>
     </w:p>
     <w:p>
       <w:pPr>

</xml_diff>

<commit_message>
Replace wrong owner name Jonathan West with Jonathan Jettoo / Jono
Co-Authored-By: Claude Sonnet 5.5 <noreply@anthropic.com>
</commit_message>
<xml_diff>
--- a/deliverables/contracts-drafter/lead-generation-agreement/lead-velocity-services-agreement.docx
+++ b/deliverables/contracts-drafter/lead-generation-agreement/lead-velocity-services-agreement.docx
@@ -2014,7 +2014,7 @@
         <w:t xml:space="preserve">Logistics-only messages.</w:t>
       </w:r>
       <w:r>
-        <w:t xml:space="preserve"> Every message Lead Velocity sends to a Consumer after consent, including the Intro Card and every reminder, is limited to logistics: the appointment date, time, method and link; the Client's name, practice name and FSP number; the statement that SortMyCover and Lead Velocity are not financial services providers and give no advice; rescheduling and cancellation; and how to opt out. Lead Velocity will not include any benefit statement, any reference to "appropriate", "right" or "best" cover, any premium or cover figure, or any other content that promotes a Financial Product, and will never repeat a Consumer's budget band back to them as a price.</w:t>
+        <w:t xml:space="preserve"> Every message Lead Velocity sends to a Consumer after consent, including the Intro Card and every reminder, is limited to logistics: the appointment date, time, method and link; the Client's name, practice name and FSP number; the statement that SortMyCover gives no financial advice, product comparisons or premium quotes; rescheduling and cancellation; and how to opt out. Lead Velocity will not include any benefit statement, any reference to "appropriate", "right" or "best" cover, any premium or cover figure, or any other content that promotes a Financial Product, and will never repeat a Consumer's budget band back to them as a price.</w:t>
       </w:r>
     </w:p>
     <w:p>
@@ -2226,7 +2226,7 @@
         <w:t xml:space="preserve">(d)	</w:t>
       </w:r>
       <w:r>
-        <w:t xml:space="preserve">introduce the Client to the Consumer on WhatsApp by sending the Client's welcome card (the Intro Card), which states the Client's name, practice name and FSP number and states that SortMyCover and Lead Velocity are not financial services providers and give no advice;</w:t>
+        <w:t xml:space="preserve">introduce the Client to the Consumer on WhatsApp by sending the Client's welcome card (the Intro Card), which states the Client's name, practice name and FSP number and states that SortMyCover gives no financial advice, product comparisons or premium quotes;</w:t>
       </w:r>
     </w:p>
     <w:p>
@@ -9286,7 +9286,7 @@
         <w:t xml:space="preserve">Intro Card and first message.</w:t>
       </w:r>
       <w:r>
-        <w:t xml:space="preserve"> The first WhatsApp message to each Consumer is the Client's welcome card. It states the Client's name, practice name and FSP number, and that SortMyCover and Lead Velocity are not financial services providers and give no advice. Lead Velocity keeps the approved text with the Origin Records.</w:t>
+        <w:t xml:space="preserve"> The first WhatsApp message to each Consumer is the Client's welcome card. It states the Client's name, practice name and FSP number, and that SortMyCover gives no financial advice, product comparisons or premium quotes. Lead Velocity keeps the approved text with the Origin Records.</w:t>
       </w:r>
     </w:p>
     <w:p>
@@ -9484,7 +9484,7 @@
         <w:t xml:space="preserve">Breach contact.</w:t>
       </w:r>
       <w:r>
-        <w:t xml:space="preserve"> Security breach notices under clause 13.7 go to: for Lead Velocity, Jonathan West (Information Officer), howzit@leadvelocity.co.za; for the Client, </w:t>
+        <w:t xml:space="preserve"> Security breach notices under clause 13.7 go to: for Lead Velocity, Jonathan Jettoo (Information Officer), howzit@leadvelocity.co.za; for the Client, </w:t>
       </w:r>
       <w:r>
         <w:rPr>

</xml_diff>